<commit_message>
Add Canterbury corpus results to the Compression Performance draft
The first draft omitted Canterbury entirely. Adds the eleven canonical
files from Table F5 as the opening subsection, so the corpora now run in
ascending size: Canterbury 2.8 MB, Silesia 212 MB, GovDocs1 628 MB.

Uses Table F5 rather than Table D1. The manuscript states that D1 is a
seven-trial developmental pilot on a five-file subset and is not the
study's primary evidence, so the eleven-file measurement is the one that
belongs in Results.

Notes that Maximum equals Balanced on five of the eleven files and exceeds
it on none, which is the nesting property behaving as designed on small
inputs rather than a failure of the deeper search.

Tables renumber to 1-6, so the measurement tables now become 7-10.

Co-Authored-By: Claude Opus 5 <noreply@anthropic.com>
Claude-Session: https://claude.ai/code/session_01BBF4FrEXkvofHmTjtH3GVA
</commit_message>
<xml_diff>
--- a/evaluation/ByteSize_Compression_Performance.docx
+++ b/evaluation/ByteSize_Compression_Performance.docx
@@ -136,7 +136,7 @@
           <w:sz w:val="20"/>
           <w:szCs w:val="20"/>
         </w:rPr>
-        <w:t xml:space="preserve">Table numbering: this subsection takes Tables 1 through 5. Your existing Automated Source-Code Measurement tables must therefore renumber from 1–4 to 6–9, and the sentences referring to them in the prose must be updated to match.</w:t>
+        <w:t xml:space="preserve">Table numbering: this subsection takes Tables 1 through 6. Your existing Automated Source-Code Measurement tables must therefore renumber from 1–4 to 6–9, and the sentences referring to them in the prose must be updated to match.</w:t>
       </w:r>
     </w:p>
     <w:p>
@@ -191,7 +191,7 @@
           <w:sz w:val="22"/>
           <w:szCs w:val="22"/>
         </w:rPr>
-        <w:t xml:space="preserve">Silesia Corpus</w:t>
+        <w:t xml:space="preserve">Canterbury Corpus</w:t>
       </w:r>
     </w:p>
     <w:p>
@@ -209,7 +209,7 @@
           <w:sz w:val="21"/>
           <w:szCs w:val="21"/>
         </w:rPr>
-        <w:t xml:space="preserve">All twelve Silesia files, totaling 211,938,580 bytes, were compressed under each of the three presets. Results appear in Table 1.</w:t>
+        <w:t xml:space="preserve">The eleven canonical Canterbury files, totaling 2,810,784 bytes, were retrieved from the corpus authority and verified against a recorded SHA-256 manifest before measurement. All eleven were measured whole; a four-file text-only subset used during drafting was superseded, because excluding the binary members removes precisely the files that constrain the corpus average. Results by preset appear in Table 1.</w:t>
       </w:r>
     </w:p>
     <w:p>
@@ -239,7 +239,7 @@
           <w:sz w:val="20"/>
           <w:szCs w:val="20"/>
         </w:rPr>
-        <w:t xml:space="preserve">Silesia Corpus Results by Preset, All Twelve Files</w:t>
+        <w:t xml:space="preserve">Canterbury Corpus Results by Preset, All Eleven Canonical Files</w:t>
       </w:r>
     </w:p>
     <w:tbl>
@@ -425,7 +425,7 @@
                 <w:sz w:val="17"/>
                 <w:szCs w:val="17"/>
               </w:rPr>
-              <w:t xml:space="preserve">98,977,766</w:t>
+              <w:t xml:space="preserve">906,759</w:t>
             </w:r>
           </w:p>
         </w:tc>
@@ -451,7 +451,7 @@
                 <w:sz w:val="17"/>
                 <w:szCs w:val="17"/>
               </w:rPr>
-              <w:t xml:space="preserve">2.14</w:t>
+              <w:t xml:space="preserve">3.10</w:t>
             </w:r>
           </w:p>
         </w:tc>
@@ -477,7 +477,7 @@
                 <w:sz w:val="17"/>
                 <w:szCs w:val="17"/>
               </w:rPr>
-              <w:t xml:space="preserve">53.30%</w:t>
+              <w:t xml:space="preserve">67.74%</w:t>
             </w:r>
           </w:p>
         </w:tc>
@@ -534,7 +534,7 @@
                 <w:sz w:val="17"/>
                 <w:szCs w:val="17"/>
               </w:rPr>
-              <w:t xml:space="preserve">87,133,292</w:t>
+              <w:t xml:space="preserve">789,536</w:t>
             </w:r>
           </w:p>
         </w:tc>
@@ -560,7 +560,7 @@
                 <w:sz w:val="17"/>
                 <w:szCs w:val="17"/>
               </w:rPr>
-              <w:t xml:space="preserve">2.43</w:t>
+              <w:t xml:space="preserve">3.56</w:t>
             </w:r>
           </w:p>
         </w:tc>
@@ -586,7 +586,7 @@
                 <w:sz w:val="17"/>
                 <w:szCs w:val="17"/>
               </w:rPr>
-              <w:t xml:space="preserve">58.89%</w:t>
+              <w:t xml:space="preserve">71.91%</w:t>
             </w:r>
           </w:p>
         </w:tc>
@@ -643,7 +643,7 @@
                 <w:sz w:val="17"/>
                 <w:szCs w:val="17"/>
               </w:rPr>
-              <w:t xml:space="preserve">83,102,753</w:t>
+              <w:t xml:space="preserve">779,600</w:t>
             </w:r>
           </w:p>
         </w:tc>
@@ -669,7 +669,7 @@
                 <w:sz w:val="17"/>
                 <w:szCs w:val="17"/>
               </w:rPr>
-              <w:t xml:space="preserve">2.55</w:t>
+              <w:t xml:space="preserve">3.61</w:t>
             </w:r>
           </w:p>
         </w:tc>
@@ -695,7 +695,7 @@
                 <w:sz w:val="17"/>
                 <w:szCs w:val="17"/>
               </w:rPr>
-              <w:t xml:space="preserve">60.79%</w:t>
+              <w:t xml:space="preserve">72.26%</w:t>
             </w:r>
           </w:p>
         </w:tc>
@@ -721,7 +721,7 @@
           <w:sz w:val="18"/>
           <w:szCs w:val="18"/>
         </w:rPr>
-        <w:t xml:space="preserve">Source bytes are 211,938,580 at every preset. All thirty-six file and preset configurations reconstructed the exact original bytes with matching SHA-256 digests.</w:t>
+        <w:t xml:space="preserve">Source bytes are 2,810,784 at every preset. All thirty-three file and preset configurations reconstructed the exact original bytes with matching SHA-256 digests.</w:t>
       </w:r>
     </w:p>
     <w:p>
@@ -739,7 +739,7 @@
           <w:sz w:val="21"/>
           <w:szCs w:val="21"/>
         </w:rPr>
-        <w:t xml:space="preserve">The Maximum Preset reduced the corpus by 60.79 percent, a compression ratio of 2.55. The nesting property held without exception: the Balanced Preset produced smaller output than Fast on all twelve files, saving 11,844,474 bytes or 11.97 percent of the Fast output, and Maximum produced smaller output than Balanced on all twelve, saving a further 4,030,539 bytes or 4.63 percent. Because no file was larger at a deeper preset, the search ladder is monotonic on this corpus, which is the behavior the preset design intends.</w:t>
+        <w:t xml:space="preserve">The Maximum Preset reduced the corpus by 72.26 percent, a compression ratio of 3.61. Per-file savings ranged from 87.74 percent on ptt5, a CCITT fax image, and 79.01 percent on kennedy.xls, an Excel spreadsheet, down to 44.55 percent on xargs.1, a short troff manual page. Two readings follow from that spread. The corpus average is carried by its two largest members, which are also its two most structurally regular: a spreadsheet of repeated numeric fields and a fax image of long runs, both of which the multi-tier scan and the bit-cost admission rule are constructed to exploit. Second, the Maximum Preset produced output identical to Balanced on five of the eleven files and larger on none. On inputs this small the additional search profiles frequently find no admissible structure the Balanced ladder has not already located, which is the nesting property behaving as designed rather than a failure of the deeper search.</w:t>
       </w:r>
     </w:p>
     <w:p>
@@ -755,7 +755,7 @@
           <w:sz w:val="22"/>
           <w:szCs w:val="22"/>
         </w:rPr>
-        <w:t xml:space="preserve">GovDocs1 Thread 000</w:t>
+        <w:t xml:space="preserve">Silesia Corpus</w:t>
       </w:r>
     </w:p>
     <w:p>
@@ -773,7 +773,7 @@
           <w:sz w:val="21"/>
           <w:szCs w:val="21"/>
         </w:rPr>
-        <w:t xml:space="preserve">GovDocs1 thread 000 is the study's sample of record for real-world documents. It comprises 980 files totaling 627,788,678 bytes, used as distributed. One archive member of 131,010,734 bytes was excluded because it exceeds the 100-megabyte per-file ceiling the system enforces, so that the evaluation corpus could not contain a file the system under study would refuse. Preset results appear in Table 2.</w:t>
+        <w:t xml:space="preserve">All twelve Silesia files, totaling 211,938,580 bytes, were compressed under each of the three presets. Results appear in Table 2.</w:t>
       </w:r>
     </w:p>
     <w:p>
@@ -789,6 +789,570 @@
           <w:szCs w:val="20"/>
         </w:rPr>
         <w:t xml:space="preserve">Table 2</w:t>
+      </w:r>
+    </w:p>
+    <w:p>
+      <w:pPr>
+        <w:spacing w:after="120"/>
+      </w:pPr>
+      <w:r>
+        <w:rPr>
+          <w:rFonts w:ascii="Calibri" w:cs="Calibri" w:eastAsia="Calibri" w:hAnsi="Calibri"/>
+          <w:i/>
+          <w:iCs/>
+          <w:sz w:val="20"/>
+          <w:szCs w:val="20"/>
+        </w:rPr>
+        <w:t xml:space="preserve">Silesia Corpus Results by Preset, All Twelve Files</w:t>
+      </w:r>
+    </w:p>
+    <w:tbl>
+      <w:tblPr>
+        <w:tblW w:type="auto" w:w="100"/>
+        <w:tblBorders>
+          <w:top w:val="single" w:color="auto" w:sz="4"/>
+          <w:left w:val="single" w:color="auto" w:sz="4"/>
+          <w:bottom w:val="single" w:color="auto" w:sz="4"/>
+          <w:right w:val="single" w:color="auto" w:sz="4"/>
+          <w:insideH w:val="single" w:color="auto" w:sz="4"/>
+          <w:insideV w:val="single" w:color="auto" w:sz="4"/>
+        </w:tblBorders>
+      </w:tblPr>
+      <w:tblGrid>
+        <w:gridCol w:w="2600"/>
+        <w:gridCol w:w="3000"/>
+        <w:gridCol w:w="1800"/>
+        <w:gridCol w:w="2000"/>
+      </w:tblGrid>
+      <w:tr>
+        <w:trPr>
+          <w:tblHeader/>
+        </w:trPr>
+        <w:tc>
+          <w:tcPr>
+            <w:tcW w:type="dxa" w:w="2600"/>
+            <w:shd w:fill="E3EEF2" w:val="clear"/>
+            <w:tcMar>
+              <w:top w:type="dxa" w:w="80"/>
+              <w:left w:type="dxa" w:w="110"/>
+              <w:bottom w:type="dxa" w:w="80"/>
+              <w:right w:type="dxa" w:w="110"/>
+            </w:tcMar>
+          </w:tcPr>
+          <w:p>
+            <w:pPr>
+              <w:jc w:val="left"/>
+            </w:pPr>
+            <w:r>
+              <w:rPr>
+                <w:rFonts w:ascii="Calibri" w:cs="Calibri" w:eastAsia="Calibri" w:hAnsi="Calibri"/>
+                <w:b/>
+                <w:bCs/>
+                <w:sz w:val="17"/>
+                <w:szCs w:val="17"/>
+              </w:rPr>
+              <w:t xml:space="preserve">Preset</w:t>
+            </w:r>
+          </w:p>
+        </w:tc>
+        <w:tc>
+          <w:tcPr>
+            <w:tcW w:type="dxa" w:w="3000"/>
+            <w:shd w:fill="E3EEF2" w:val="clear"/>
+            <w:tcMar>
+              <w:top w:type="dxa" w:w="80"/>
+              <w:left w:type="dxa" w:w="110"/>
+              <w:bottom w:type="dxa" w:w="80"/>
+              <w:right w:type="dxa" w:w="110"/>
+            </w:tcMar>
+          </w:tcPr>
+          <w:p>
+            <w:pPr>
+              <w:jc w:val="right"/>
+            </w:pPr>
+            <w:r>
+              <w:rPr>
+                <w:rFonts w:ascii="Calibri" w:cs="Calibri" w:eastAsia="Calibri" w:hAnsi="Calibri"/>
+                <w:b/>
+                <w:bCs/>
+                <w:sz w:val="17"/>
+                <w:szCs w:val="17"/>
+              </w:rPr>
+              <w:t xml:space="preserve">AFC bytes</w:t>
+            </w:r>
+          </w:p>
+        </w:tc>
+        <w:tc>
+          <w:tcPr>
+            <w:tcW w:type="dxa" w:w="1800"/>
+            <w:shd w:fill="E3EEF2" w:val="clear"/>
+            <w:tcMar>
+              <w:top w:type="dxa" w:w="80"/>
+              <w:left w:type="dxa" w:w="110"/>
+              <w:bottom w:type="dxa" w:w="80"/>
+              <w:right w:type="dxa" w:w="110"/>
+            </w:tcMar>
+          </w:tcPr>
+          <w:p>
+            <w:pPr>
+              <w:jc w:val="right"/>
+            </w:pPr>
+            <w:r>
+              <w:rPr>
+                <w:rFonts w:ascii="Calibri" w:cs="Calibri" w:eastAsia="Calibri" w:hAnsi="Calibri"/>
+                <w:b/>
+                <w:bCs/>
+                <w:sz w:val="17"/>
+                <w:szCs w:val="17"/>
+              </w:rPr>
+              <w:t xml:space="preserve">Ratio</w:t>
+            </w:r>
+          </w:p>
+        </w:tc>
+        <w:tc>
+          <w:tcPr>
+            <w:tcW w:type="dxa" w:w="2000"/>
+            <w:shd w:fill="E3EEF2" w:val="clear"/>
+            <w:tcMar>
+              <w:top w:type="dxa" w:w="80"/>
+              <w:left w:type="dxa" w:w="110"/>
+              <w:bottom w:type="dxa" w:w="80"/>
+              <w:right w:type="dxa" w:w="110"/>
+            </w:tcMar>
+          </w:tcPr>
+          <w:p>
+            <w:pPr>
+              <w:jc w:val="right"/>
+            </w:pPr>
+            <w:r>
+              <w:rPr>
+                <w:rFonts w:ascii="Calibri" w:cs="Calibri" w:eastAsia="Calibri" w:hAnsi="Calibri"/>
+                <w:b/>
+                <w:bCs/>
+                <w:sz w:val="17"/>
+                <w:szCs w:val="17"/>
+              </w:rPr>
+              <w:t xml:space="preserve">Saved</w:t>
+            </w:r>
+          </w:p>
+        </w:tc>
+      </w:tr>
+      <w:tr>
+        <w:trPr>
+          <w:tblHeader w:val="false"/>
+        </w:trPr>
+        <w:tc>
+          <w:tcPr>
+            <w:tcW w:type="dxa" w:w="2600"/>
+            <w:tcMar>
+              <w:top w:type="dxa" w:w="80"/>
+              <w:left w:type="dxa" w:w="110"/>
+              <w:bottom w:type="dxa" w:w="80"/>
+              <w:right w:type="dxa" w:w="110"/>
+            </w:tcMar>
+          </w:tcPr>
+          <w:p>
+            <w:pPr>
+              <w:jc w:val="left"/>
+            </w:pPr>
+            <w:r>
+              <w:rPr>
+                <w:rFonts w:ascii="Calibri" w:cs="Calibri" w:eastAsia="Calibri" w:hAnsi="Calibri"/>
+                <w:b w:val="false"/>
+                <w:bCs w:val="false"/>
+                <w:sz w:val="17"/>
+                <w:szCs w:val="17"/>
+              </w:rPr>
+              <w:t xml:space="preserve">Fast</w:t>
+            </w:r>
+          </w:p>
+        </w:tc>
+        <w:tc>
+          <w:tcPr>
+            <w:tcW w:type="dxa" w:w="3000"/>
+            <w:tcMar>
+              <w:top w:type="dxa" w:w="80"/>
+              <w:left w:type="dxa" w:w="110"/>
+              <w:bottom w:type="dxa" w:w="80"/>
+              <w:right w:type="dxa" w:w="110"/>
+            </w:tcMar>
+          </w:tcPr>
+          <w:p>
+            <w:pPr>
+              <w:jc w:val="right"/>
+            </w:pPr>
+            <w:r>
+              <w:rPr>
+                <w:rFonts w:ascii="Calibri" w:cs="Calibri" w:eastAsia="Calibri" w:hAnsi="Calibri"/>
+                <w:b w:val="false"/>
+                <w:bCs w:val="false"/>
+                <w:sz w:val="17"/>
+                <w:szCs w:val="17"/>
+              </w:rPr>
+              <w:t xml:space="preserve">98,977,766</w:t>
+            </w:r>
+          </w:p>
+        </w:tc>
+        <w:tc>
+          <w:tcPr>
+            <w:tcW w:type="dxa" w:w="1800"/>
+            <w:tcMar>
+              <w:top w:type="dxa" w:w="80"/>
+              <w:left w:type="dxa" w:w="110"/>
+              <w:bottom w:type="dxa" w:w="80"/>
+              <w:right w:type="dxa" w:w="110"/>
+            </w:tcMar>
+          </w:tcPr>
+          <w:p>
+            <w:pPr>
+              <w:jc w:val="right"/>
+            </w:pPr>
+            <w:r>
+              <w:rPr>
+                <w:rFonts w:ascii="Calibri" w:cs="Calibri" w:eastAsia="Calibri" w:hAnsi="Calibri"/>
+                <w:b w:val="false"/>
+                <w:bCs w:val="false"/>
+                <w:sz w:val="17"/>
+                <w:szCs w:val="17"/>
+              </w:rPr>
+              <w:t xml:space="preserve">2.14</w:t>
+            </w:r>
+          </w:p>
+        </w:tc>
+        <w:tc>
+          <w:tcPr>
+            <w:tcW w:type="dxa" w:w="2000"/>
+            <w:tcMar>
+              <w:top w:type="dxa" w:w="80"/>
+              <w:left w:type="dxa" w:w="110"/>
+              <w:bottom w:type="dxa" w:w="80"/>
+              <w:right w:type="dxa" w:w="110"/>
+            </w:tcMar>
+          </w:tcPr>
+          <w:p>
+            <w:pPr>
+              <w:jc w:val="right"/>
+            </w:pPr>
+            <w:r>
+              <w:rPr>
+                <w:rFonts w:ascii="Calibri" w:cs="Calibri" w:eastAsia="Calibri" w:hAnsi="Calibri"/>
+                <w:b w:val="false"/>
+                <w:bCs w:val="false"/>
+                <w:sz w:val="17"/>
+                <w:szCs w:val="17"/>
+              </w:rPr>
+              <w:t xml:space="preserve">53.30%</w:t>
+            </w:r>
+          </w:p>
+        </w:tc>
+      </w:tr>
+      <w:tr>
+        <w:trPr>
+          <w:tblHeader w:val="false"/>
+        </w:trPr>
+        <w:tc>
+          <w:tcPr>
+            <w:tcW w:type="dxa" w:w="2600"/>
+            <w:tcMar>
+              <w:top w:type="dxa" w:w="80"/>
+              <w:left w:type="dxa" w:w="110"/>
+              <w:bottom w:type="dxa" w:w="80"/>
+              <w:right w:type="dxa" w:w="110"/>
+            </w:tcMar>
+          </w:tcPr>
+          <w:p>
+            <w:pPr>
+              <w:jc w:val="left"/>
+            </w:pPr>
+            <w:r>
+              <w:rPr>
+                <w:rFonts w:ascii="Calibri" w:cs="Calibri" w:eastAsia="Calibri" w:hAnsi="Calibri"/>
+                <w:b w:val="false"/>
+                <w:bCs w:val="false"/>
+                <w:sz w:val="17"/>
+                <w:szCs w:val="17"/>
+              </w:rPr>
+              <w:t xml:space="preserve">Balanced</w:t>
+            </w:r>
+          </w:p>
+        </w:tc>
+        <w:tc>
+          <w:tcPr>
+            <w:tcW w:type="dxa" w:w="3000"/>
+            <w:tcMar>
+              <w:top w:type="dxa" w:w="80"/>
+              <w:left w:type="dxa" w:w="110"/>
+              <w:bottom w:type="dxa" w:w="80"/>
+              <w:right w:type="dxa" w:w="110"/>
+            </w:tcMar>
+          </w:tcPr>
+          <w:p>
+            <w:pPr>
+              <w:jc w:val="right"/>
+            </w:pPr>
+            <w:r>
+              <w:rPr>
+                <w:rFonts w:ascii="Calibri" w:cs="Calibri" w:eastAsia="Calibri" w:hAnsi="Calibri"/>
+                <w:b w:val="false"/>
+                <w:bCs w:val="false"/>
+                <w:sz w:val="17"/>
+                <w:szCs w:val="17"/>
+              </w:rPr>
+              <w:t xml:space="preserve">87,133,292</w:t>
+            </w:r>
+          </w:p>
+        </w:tc>
+        <w:tc>
+          <w:tcPr>
+            <w:tcW w:type="dxa" w:w="1800"/>
+            <w:tcMar>
+              <w:top w:type="dxa" w:w="80"/>
+              <w:left w:type="dxa" w:w="110"/>
+              <w:bottom w:type="dxa" w:w="80"/>
+              <w:right w:type="dxa" w:w="110"/>
+            </w:tcMar>
+          </w:tcPr>
+          <w:p>
+            <w:pPr>
+              <w:jc w:val="right"/>
+            </w:pPr>
+            <w:r>
+              <w:rPr>
+                <w:rFonts w:ascii="Calibri" w:cs="Calibri" w:eastAsia="Calibri" w:hAnsi="Calibri"/>
+                <w:b w:val="false"/>
+                <w:bCs w:val="false"/>
+                <w:sz w:val="17"/>
+                <w:szCs w:val="17"/>
+              </w:rPr>
+              <w:t xml:space="preserve">2.43</w:t>
+            </w:r>
+          </w:p>
+        </w:tc>
+        <w:tc>
+          <w:tcPr>
+            <w:tcW w:type="dxa" w:w="2000"/>
+            <w:tcMar>
+              <w:top w:type="dxa" w:w="80"/>
+              <w:left w:type="dxa" w:w="110"/>
+              <w:bottom w:type="dxa" w:w="80"/>
+              <w:right w:type="dxa" w:w="110"/>
+            </w:tcMar>
+          </w:tcPr>
+          <w:p>
+            <w:pPr>
+              <w:jc w:val="right"/>
+            </w:pPr>
+            <w:r>
+              <w:rPr>
+                <w:rFonts w:ascii="Calibri" w:cs="Calibri" w:eastAsia="Calibri" w:hAnsi="Calibri"/>
+                <w:b w:val="false"/>
+                <w:bCs w:val="false"/>
+                <w:sz w:val="17"/>
+                <w:szCs w:val="17"/>
+              </w:rPr>
+              <w:t xml:space="preserve">58.89%</w:t>
+            </w:r>
+          </w:p>
+        </w:tc>
+      </w:tr>
+      <w:tr>
+        <w:trPr>
+          <w:tblHeader w:val="false"/>
+        </w:trPr>
+        <w:tc>
+          <w:tcPr>
+            <w:tcW w:type="dxa" w:w="2600"/>
+            <w:tcMar>
+              <w:top w:type="dxa" w:w="80"/>
+              <w:left w:type="dxa" w:w="110"/>
+              <w:bottom w:type="dxa" w:w="80"/>
+              <w:right w:type="dxa" w:w="110"/>
+            </w:tcMar>
+          </w:tcPr>
+          <w:p>
+            <w:pPr>
+              <w:jc w:val="left"/>
+            </w:pPr>
+            <w:r>
+              <w:rPr>
+                <w:rFonts w:ascii="Calibri" w:cs="Calibri" w:eastAsia="Calibri" w:hAnsi="Calibri"/>
+                <w:b w:val="false"/>
+                <w:bCs w:val="false"/>
+                <w:sz w:val="17"/>
+                <w:szCs w:val="17"/>
+              </w:rPr>
+              <w:t xml:space="preserve">Maximum</w:t>
+            </w:r>
+          </w:p>
+        </w:tc>
+        <w:tc>
+          <w:tcPr>
+            <w:tcW w:type="dxa" w:w="3000"/>
+            <w:tcMar>
+              <w:top w:type="dxa" w:w="80"/>
+              <w:left w:type="dxa" w:w="110"/>
+              <w:bottom w:type="dxa" w:w="80"/>
+              <w:right w:type="dxa" w:w="110"/>
+            </w:tcMar>
+          </w:tcPr>
+          <w:p>
+            <w:pPr>
+              <w:jc w:val="right"/>
+            </w:pPr>
+            <w:r>
+              <w:rPr>
+                <w:rFonts w:ascii="Calibri" w:cs="Calibri" w:eastAsia="Calibri" w:hAnsi="Calibri"/>
+                <w:b w:val="false"/>
+                <w:bCs w:val="false"/>
+                <w:sz w:val="17"/>
+                <w:szCs w:val="17"/>
+              </w:rPr>
+              <w:t xml:space="preserve">83,102,753</w:t>
+            </w:r>
+          </w:p>
+        </w:tc>
+        <w:tc>
+          <w:tcPr>
+            <w:tcW w:type="dxa" w:w="1800"/>
+            <w:tcMar>
+              <w:top w:type="dxa" w:w="80"/>
+              <w:left w:type="dxa" w:w="110"/>
+              <w:bottom w:type="dxa" w:w="80"/>
+              <w:right w:type="dxa" w:w="110"/>
+            </w:tcMar>
+          </w:tcPr>
+          <w:p>
+            <w:pPr>
+              <w:jc w:val="right"/>
+            </w:pPr>
+            <w:r>
+              <w:rPr>
+                <w:rFonts w:ascii="Calibri" w:cs="Calibri" w:eastAsia="Calibri" w:hAnsi="Calibri"/>
+                <w:b w:val="false"/>
+                <w:bCs w:val="false"/>
+                <w:sz w:val="17"/>
+                <w:szCs w:val="17"/>
+              </w:rPr>
+              <w:t xml:space="preserve">2.55</w:t>
+            </w:r>
+          </w:p>
+        </w:tc>
+        <w:tc>
+          <w:tcPr>
+            <w:tcW w:type="dxa" w:w="2000"/>
+            <w:tcMar>
+              <w:top w:type="dxa" w:w="80"/>
+              <w:left w:type="dxa" w:w="110"/>
+              <w:bottom w:type="dxa" w:w="80"/>
+              <w:right w:type="dxa" w:w="110"/>
+            </w:tcMar>
+          </w:tcPr>
+          <w:p>
+            <w:pPr>
+              <w:jc w:val="right"/>
+            </w:pPr>
+            <w:r>
+              <w:rPr>
+                <w:rFonts w:ascii="Calibri" w:cs="Calibri" w:eastAsia="Calibri" w:hAnsi="Calibri"/>
+                <w:b w:val="false"/>
+                <w:bCs w:val="false"/>
+                <w:sz w:val="17"/>
+                <w:szCs w:val="17"/>
+              </w:rPr>
+              <w:t xml:space="preserve">60.79%</w:t>
+            </w:r>
+          </w:p>
+        </w:tc>
+      </w:tr>
+    </w:tbl>
+    <w:p>
+      <w:pPr>
+        <w:spacing w:after="220" w:before="100"/>
+      </w:pPr>
+      <w:r>
+        <w:rPr>
+          <w:rFonts w:ascii="Calibri" w:cs="Calibri" w:eastAsia="Calibri" w:hAnsi="Calibri"/>
+          <w:i/>
+          <w:iCs/>
+          <w:sz w:val="18"/>
+          <w:szCs w:val="18"/>
+        </w:rPr>
+        <w:t xml:space="preserve">Note. </w:t>
+      </w:r>
+      <w:r>
+        <w:rPr>
+          <w:rFonts w:ascii="Calibri" w:cs="Calibri" w:eastAsia="Calibri" w:hAnsi="Calibri"/>
+          <w:sz w:val="18"/>
+          <w:szCs w:val="18"/>
+        </w:rPr>
+        <w:t xml:space="preserve">Source bytes are 211,938,580 at every preset. All thirty-six file and preset configurations reconstructed the exact original bytes with matching SHA-256 digests.</w:t>
+      </w:r>
+    </w:p>
+    <w:p>
+      <w:pPr>
+        <w:spacing w:after="170" w:line="300"/>
+      </w:pPr>
+      <w:r>
+        <w:rPr>
+          <w:rFonts w:ascii="Cambria" w:cs="Cambria" w:eastAsia="Cambria" w:hAnsi="Cambria"/>
+          <w:b w:val="false"/>
+          <w:bCs w:val="false"/>
+          <w:i w:val="false"/>
+          <w:iCs w:val="false"/>
+          <w:color w:val="000000"/>
+          <w:sz w:val="21"/>
+          <w:szCs w:val="21"/>
+        </w:rPr>
+        <w:t xml:space="preserve">The Maximum Preset reduced the corpus by 60.79 percent, a compression ratio of 2.55. The nesting property held without exception: the Balanced Preset produced smaller output than Fast on all twelve files, saving 11,844,474 bytes or 11.97 percent of the Fast output, and Maximum produced smaller output than Balanced on all twelve, saving a further 4,030,539 bytes or 4.63 percent. Because no file was larger at a deeper preset, the search ladder is monotonic on this corpus, which is the behavior the preset design intends.</w:t>
+      </w:r>
+    </w:p>
+    <w:p>
+      <w:pPr>
+        <w:pStyle w:val="Heading3"/>
+        <w:spacing w:after="120" w:before="280"/>
+      </w:pPr>
+      <w:r>
+        <w:rPr>
+          <w:rFonts w:ascii="Cambria" w:cs="Cambria" w:eastAsia="Cambria" w:hAnsi="Cambria"/>
+          <w:b/>
+          <w:bCs/>
+          <w:sz w:val="22"/>
+          <w:szCs w:val="22"/>
+        </w:rPr>
+        <w:t xml:space="preserve">GovDocs1 Thread 000</w:t>
+      </w:r>
+    </w:p>
+    <w:p>
+      <w:pPr>
+        <w:spacing w:after="170" w:line="300"/>
+      </w:pPr>
+      <w:r>
+        <w:rPr>
+          <w:rFonts w:ascii="Cambria" w:cs="Cambria" w:eastAsia="Cambria" w:hAnsi="Cambria"/>
+          <w:b w:val="false"/>
+          <w:bCs w:val="false"/>
+          <w:i w:val="false"/>
+          <w:iCs w:val="false"/>
+          <w:color w:val="000000"/>
+          <w:sz w:val="21"/>
+          <w:szCs w:val="21"/>
+        </w:rPr>
+        <w:t xml:space="preserve">GovDocs1 thread 000 is the study's sample of record for real-world documents. It comprises 980 files totaling 627,788,678 bytes, used as distributed. One archive member of 131,010,734 bytes was excluded because it exceeds the 100-megabyte per-file ceiling the system enforces, so that the evaluation corpus could not contain a file the system under study would refuse. Preset results appear in Table 3.</w:t>
+      </w:r>
+    </w:p>
+    <w:p>
+      <w:pPr>
+        <w:spacing w:after="40" w:before="280"/>
+      </w:pPr>
+      <w:r>
+        <w:rPr>
+          <w:rFonts w:ascii="Calibri" w:cs="Calibri" w:eastAsia="Calibri" w:hAnsi="Calibri"/>
+          <w:b/>
+          <w:bCs/>
+          <w:sz w:val="20"/>
+          <w:szCs w:val="20"/>
+        </w:rPr>
+        <w:t xml:space="preserve">Table 3</w:t>
       </w:r>
     </w:p>
     <w:p>
@@ -1231,7 +1795,7 @@
           <w:sz w:val="21"/>
           <w:szCs w:val="21"/>
         </w:rPr>
-        <w:t xml:space="preserve">The single-tier Huffman baseline is the comparison the study's central claim rests on, and the general-purpose compressors GZIP, BZIP2, and LZMA are reported alongside it as reference points rather than as targets. Aggregate results across the full corpus appear in Table 3, together with the formats at each extreme of the distribution.</w:t>
+        <w:t xml:space="preserve">The single-tier Huffman baseline is the comparison the study's central claim rests on, and the general-purpose compressors GZIP, BZIP2, and LZMA are reported alongside it as reference points rather than as targets. Aggregate results across the full corpus appear in Table 4, together with the formats at each extreme of the distribution.</w:t>
       </w:r>
     </w:p>
     <w:p>
@@ -1246,7 +1810,7 @@
           <w:sz w:val="20"/>
           <w:szCs w:val="20"/>
         </w:rPr>
-        <w:t xml:space="preserve">Table 3</w:t>
+        <w:t xml:space="preserve">Table 4</w:t>
       </w:r>
     </w:p>
     <w:p>
@@ -3795,7 +4359,7 @@
           <w:sz w:val="21"/>
           <w:szCs w:val="21"/>
         </w:rPr>
-        <w:t xml:space="preserve">The whole-system comparison establishes that the Adaptive System reduces output below the single-tier Huffman baseline but cannot attribute that reduction to any particular component. A component ablation was therefore conducted on two corpora, evaluating four builds: the complete system, Tier 3 disabled, Tiers 2 and 3 disabled, and the Bit Cost Decision Engine replaced by an unconditional frequency-only decision. All four builds ran on the pure-Python reference implementation with the engine's default options and no preset search ladder, so that observed differences are attributable to the disabled component rather than to backend or preset variation. Results appear in Table 4.</w:t>
+        <w:t xml:space="preserve">The whole-system comparison establishes that the Adaptive System reduces output below the single-tier Huffman baseline but cannot attribute that reduction to any particular component. A component ablation was therefore conducted on two corpora, evaluating four builds: the complete system, Tier 3 disabled, Tiers 2 and 3 disabled, and the Bit Cost Decision Engine replaced by an unconditional frequency-only decision. All four builds ran on the pure-Python reference implementation with the engine's default options and no preset search ladder, so that observed differences are attributable to the disabled component rather than to backend or preset variation. Results appear in Table 5.</w:t>
       </w:r>
     </w:p>
     <w:p>
@@ -3810,7 +4374,7 @@
           <w:sz w:val="20"/>
           <w:szCs w:val="20"/>
         </w:rPr>
-        <w:t xml:space="preserve">Table 4</w:t>
+        <w:t xml:space="preserve">Table 5</w:t>
       </w:r>
     </w:p>
     <w:p>
@@ -4701,7 +5265,7 @@
           <w:sz w:val="21"/>
           <w:szCs w:val="21"/>
         </w:rPr>
-        <w:t xml:space="preserve">Table 5 states what each component earns, measured against the build that isolates it.</w:t>
+        <w:t xml:space="preserve">Table 6 states what each component earns, measured against the build that isolates it.</w:t>
       </w:r>
     </w:p>
     <w:p>
@@ -4716,7 +5280,7 @@
           <w:sz w:val="20"/>
           <w:szCs w:val="20"/>
         </w:rPr>
-        <w:t xml:space="preserve">Table 5</w:t>
+        <w:t xml:space="preserve">Table 6</w:t>
       </w:r>
     </w:p>
     <w:p>
@@ -5333,7 +5897,7 @@
           <w:sz w:val="21"/>
           <w:szCs w:val="21"/>
         </w:rPr>
-        <w:t xml:space="preserve">This subsection takes Tables 1 through 5. Your Automated Source-Code Measurement subsection currently uses Tables 1 through 4 and must become 6 through 9. Update both the table captions and the sentences that refer to them: “Table 1 summarizes the measurement scope and toolchain” becomes Table 6, and so on.</w:t>
+        <w:t xml:space="preserve">This subsection takes Tables 1 through 6. Your Automated Source-Code Measurement subsection currently uses Tables 1 through 4 and must become 7 through 10. Update both the table captions and the sentences that refer to them: “Table 1 summarizes the measurement scope and toolchain” becomes Table 7, and so on.</w:t>
       </w:r>
     </w:p>
     <w:p>
@@ -5401,7 +5965,7 @@
           <w:sz w:val="21"/>
           <w:szCs w:val="21"/>
         </w:rPr>
-        <w:t xml:space="preserve">Table 3 above shows eight of the sixteen formats — the extremes at each end plus the total — and refers the reader to Appendix F for the rest. If your adviser prefers the complete breakdown in the body, paste all sixteen rows from Table F3. If the department prefers lean results chapters, this abbreviated form is defensible and the appendix carries the full detail.</w:t>
+        <w:t xml:space="preserve">Table 4 above shows eight of the sixteen formats — the extremes at each end plus the total — and refers the reader to Appendix F for the rest. If your adviser prefers the complete breakdown in the body, paste all sixteen rows from Table F3. If the department prefers lean results chapters, this abbreviated form is defensible and the appendix carries the full detail.</w:t>
       </w:r>
     </w:p>
     <w:p>

</xml_diff>